<commit_message>
docs: bump Zenodo citation to v1.0.14 (record 21933675)
Update manuscript (v6/v5), README, and S2 checklist Zenodo references from v1.0.13 / 21922961 to v1.0.14 / 21933675 (concept DOI 21531272 unchanged). Reflects the corrected record title (state classification under proxy labels).
</commit_message>
<xml_diff>
--- a/docx/paper_en_submission_v6.docx
+++ b/docx/paper_en_submission_v6.docx
@@ -11536,7 +11536,7 @@
         <w:spacing w:after="0" w:line="480" w:lineRule="auto"/>
       </w:pPr>
       <w:r>
-        <w:t>The complete source code, experiment scripts, configuration files and result files are released under the MIT license. Every result reported in this paper was produced by the code archived under the concept DOI https://doi.org/10.5281/zenodo.21531272 (v1.0.13 versioned record https://doi.org/10.5281/zenodo.21922961) and released at https://github.com/korose523/Hypnotise (tag v1.0.13). All paths in the released code are relative to the repository root, the analysis environment is pinned by requirements.txt, and the experiment parameters quoted throughout this paper are held in config.yaml.</w:t>
+        <w:t>The complete source code, experiment scripts, configuration files and result files are released under the MIT license. Every result reported in this paper was produced by the code archived under the concept DOI https://doi.org/10.5281/zenodo.21531272 (v1.0.14 versioned record https://doi.org/10.5281/zenodo.21933675) and released at https://github.com/korose523/Hypnotise (tag v1.0.14). All paths in the released code are relative to the repository root, the analysis environment is pinned by requirements.txt, and the experiment parameters quoted throughout this paper are held in config.yaml.</w:t>
       </w:r>
       <w:proofErr w:type="spellStart"/>
       <w:r/>
@@ -11575,7 +11575,7 @@
         <w:spacing w:after="0" w:line="480" w:lineRule="auto"/>
       </w:pPr>
       <w:r>
-        <w:t>Table 14. Reproducibility map: the script and result file that regenerate every table reported in this manuscript. Scripts are released under the MIT license at https://github.com/korose523/Hypnotise (tag v1.0.13); result files are archived at https://doi.org/10.5281/zenodo.21531272 (concept DOI; v1.0.13 versioned record https://doi.org/10.5281/zenodo.21922961).</w:t>
+        <w:t>Table 14. Reproducibility map: the script and result file that regenerate every table reported in this manuscript. Scripts are released under the MIT license at https://github.com/korose523/Hypnotise (tag v1.0.14); result files are archived at https://doi.org/10.5281/zenodo.21531272 (concept DOI; v1.0.14 versioned record https://doi.org/10.5281/zenodo.21933675).</w:t>
       </w:r>
       <w:proofErr w:type="spellStart"/>
       <w:proofErr w:type="gramStart"/>
@@ -12345,7 +12345,7 @@
         <w:spacing w:after="0" w:line="480" w:lineRule="auto"/>
       </w:pPr>
       <w:r>
-        <w:t>The archive under concept DOI https://doi.org/10.5281/zenodo.21531272 (v1.0.13 versioned record https://doi.org/10.5281/zenodo.21922961) contains the analysis code, configuration files and the complete result files from which every table in this paper is generated, so all reported numbers can be re-derived without recomputation. The intermediate feature and label matrices are not redistributed: they run to tens of gigabytes and are derivative works of datasets released under their own licenses. They are regenerated deterministically from the raw sources by the preprocessing scripts listed above, and the participant-level split assignments follow from the participant identifiers described in Section 3.2 together with the seeds listed in Appendix A.</w:t>
+        <w:t>The archive under concept DOI https://doi.org/10.5281/zenodo.21531272 (v1.0.14 versioned record https://doi.org/10.5281/zenodo.21933675) contains the analysis code, configuration files and the complete result files from which every table in this paper is generated, so all reported numbers can be re-derived without recomputation. The intermediate feature and label matrices are not redistributed: they run to tens of gigabytes and are derivative works of datasets released under their own licenses. They are regenerated deterministically from the raw sources by the preprocessing scripts listed above, and the participant-level split assignments follow from the participant identifiers described in Section 3.2 together with the seeds listed in Appendix A.</w:t>
       </w:r>
       <w:proofErr w:type="spellStart"/>
       <w:r/>

</xml_diff>